<commit_message>
1.2.2.6: Sync now removed for everyone; design D16 Close the team (step 1, now 1.2.2.7)
Co-Authored-By: Claude Opus 5.5 <noreply@anthropic.com>
</commit_message>
<xml_diff>
--- a/TEAM_ADVANCED_MODE_DESIGN.docx
+++ b/TEAM_ADVANCED_MODE_DESIGN.docx
@@ -30,7 +30,7 @@
         <w:rPr>
           <w:b w:val="0"/>
         </w:rPr>
-        <w:t xml:space="preserve"> (test builds 1.2.2.5, 1.2.2.6 …)</w:t>
+        <w:t xml:space="preserve"> (test builds 1.2.2.5, 1.2.2.6 …; step 1 from 1.2.2.7)</w:t>
       </w:r>
     </w:p>
     <w:p>
@@ -7020,7 +7020,7 @@
               <w:rPr>
                 <w:b w:val="0"/>
               </w:rPr>
-              <w:t>1.2.2.5</w:t>
+              <w:t>1.2.2.5; fixes 1.2.2.6 (clear "✓ Saved", creator from team.json, Team Lead has no Leave the team, Sync now removed)</w:t>
             </w:r>
           </w:p>
         </w:tc>
@@ -7069,7 +7069,13 @@
               <w:rPr>
                 <w:b w:val="0"/>
               </w:rPr>
-              <w:t>: hand-over between two members, a non-lead's group record ignored on every PC.</w:t>
+              <w:t xml:space="preserve">: hand-over between two members, a non-lead's group record ignored on every PC. </w:t>
+            </w:r>
+            <w:r>
+              <w:rPr>
+                <w:b/>
+              </w:rPr>
+              <w:t>Close the team… (D16).</w:t>
             </w:r>
           </w:p>
         </w:tc>
@@ -7083,7 +7089,7 @@
               <w:rPr>
                 <w:b w:val="0"/>
               </w:rPr>
-              <w:t>1.2.2.6</w:t>
+              <w:t>1.2.2.7</w:t>
             </w:r>
           </w:p>
         </w:tc>
@@ -7146,7 +7152,7 @@
               <w:rPr>
                 <w:b w:val="0"/>
               </w:rPr>
-              <w:t>1.2.2.7</w:t>
+              <w:t>1.2.2.8</w:t>
             </w:r>
           </w:p>
         </w:tc>
@@ -7196,7 +7202,7 @@
               <w:rPr>
                 <w:b w:val="0"/>
               </w:rPr>
-              <w:t>1.2.2.8</w:t>
+              <w:t>1.2.2.9</w:t>
             </w:r>
           </w:p>
         </w:tc>
@@ -7272,7 +7278,7 @@
               <w:rPr>
                 <w:b w:val="0"/>
               </w:rPr>
-              <w:t>1.2.2.9</w:t>
+              <w:t>1.2.2.10</w:t>
             </w:r>
           </w:p>
         </w:tc>
@@ -7348,7 +7354,7 @@
               <w:rPr>
                 <w:b w:val="0"/>
               </w:rPr>
-              <w:t>1.2.2.10</w:t>
+              <w:t>1.2.2.11</w:t>
             </w:r>
           </w:p>
         </w:tc>
@@ -8484,6 +8490,121 @@
           <w:b w:val="0"/>
         </w:rPr>
         <w:t>.</w:t>
+      </w:r>
+    </w:p>
+    <w:p>
+      <w:pPr>
+        <w:pStyle w:val="ListBullet"/>
+      </w:pPr>
+      <w:r>
+        <w:rPr>
+          <w:b/>
+        </w:rPr>
+        <w:t>D16 — Close the team (Boaz, 2026-10-08).</w:t>
+      </w:r>
+      <w:r>
+        <w:rPr>
+          <w:b w:val="0"/>
+        </w:rPr>
+        <w:t xml:space="preserve"> The Team Lead does not leave a team they lead; "Leave the team" is</w:t>
+      </w:r>
+    </w:p>
+    <w:p>
+      <w:r>
+        <w:rPr>
+          <w:b w:val="0"/>
+        </w:rPr>
+        <w:t xml:space="preserve">  hidden for them (done in 1.2.2.6, together with removing "Sync now" for everyone - the automatic sync runs every few</w:t>
+      </w:r>
+    </w:p>
+    <w:p>
+      <w:r>
+        <w:rPr>
+          <w:b w:val="0"/>
+        </w:rPr>
+        <w:t xml:space="preserve">  seconds). Instead the Team Lead gets </w:t>
+      </w:r>
+      <w:r>
+        <w:rPr>
+          <w:b/>
+        </w:rPr>
+        <w:t>Close the team…</w:t>
+      </w:r>
+      <w:r>
+        <w:rPr>
+          <w:b w:val="0"/>
+        </w:rPr>
+        <w:t xml:space="preserve"> (red, where Leave the team is for members; not for the</w:t>
+      </w:r>
+    </w:p>
+    <w:p>
+      <w:r>
+        <w:rPr>
+          <w:b w:val="0"/>
+        </w:rPr>
+        <w:t xml:space="preserve">  deputy):</w:t>
+      </w:r>
+    </w:p>
+    <w:p>
+      <w:r>
+        <w:rPr>
+          <w:b w:val="0"/>
+        </w:rPr>
+        <w:t xml:space="preserve">  - every PC stops sharing; each member keeps the data as it is at that moment, as their own copy;</w:t>
+      </w:r>
+    </w:p>
+    <w:p>
+      <w:r>
+        <w:rPr>
+          <w:b w:val="0"/>
+        </w:rPr>
+        <w:t xml:space="preserve">  - all assignments end; the team folder is marked closed, so nobody can join it again;</w:t>
+      </w:r>
+    </w:p>
+    <w:p>
+      <w:r>
+        <w:rPr>
+          <w:b w:val="0"/>
+        </w:rPr>
+        <w:t xml:space="preserve">  - confirm: "Close the team 'TimeToAct2'? Everyone stops sharing; each person keeps a copy of the data as it is</w:t>
+      </w:r>
+    </w:p>
+    <w:p>
+      <w:r>
+        <w:rPr>
+          <w:b w:val="0"/>
+        </w:rPr>
+        <w:t xml:space="preserve">    now. This cannot be undone. To keep the team going without you, make someone else Team Lead instead.";</w:t>
+      </w:r>
+    </w:p>
+    <w:p>
+      <w:r>
+        <w:rPr>
+          <w:b w:val="0"/>
+        </w:rPr>
+        <w:t xml:space="preserve">  - a Team Lead who wants to leave hands the role over first (Make Team Lead…) and then leaves as a Member.</w:t>
+      </w:r>
+    </w:p>
+    <w:p>
+      <w:r>
+        <w:rPr>
+          <w:b w:val="0"/>
+        </w:rPr>
+        <w:t xml:space="preserve">  Built in step 1.</w:t>
+      </w:r>
+    </w:p>
+    <w:p>
+      <w:r>
+        <w:rPr>
+          <w:b w:val="0"/>
+        </w:rPr>
+        <w:t xml:space="preserve">  </w:t>
+      </w:r>
+      <w:r>
+        <w:rPr>
+          <w:b/>
+        </w:rPr>
+        <w:t>Answer 2026-10-08: agreed as proposed.</w:t>
       </w:r>
     </w:p>
     <w:sectPr>

</xml_diff>

<commit_message>
1.2.3 team advanced mode design: D17 invitations, D18 team from a list (proposed, step 1b = 1.2.2.8)
Co-Authored-By: Claude Opus 5.5 <noreply@anthropic.com>
</commit_message>
<xml_diff>
--- a/TEAM_ADVANCED_MODE_DESIGN.docx
+++ b/TEAM_ADVANCED_MODE_DESIGN.docx
@@ -30,7 +30,7 @@
         <w:rPr>
           <w:b w:val="0"/>
         </w:rPr>
-        <w:t xml:space="preserve"> (test builds 1.2.2.5, 1.2.2.6 …; step 1 from 1.2.2.7)</w:t>
+        <w:t xml:space="preserve"> (test builds 1.2.2.5, 1.2.2.6 …; step 1 = 1.2.2.7, step 1b = 1.2.2.8)</w:t>
       </w:r>
     </w:p>
     <w:p>
@@ -6515,6 +6515,584 @@
         <w:rPr>
           <w:b w:val="0"/>
         </w:rPr>
+        <w:t>10a. Invitations and the team list (D17, D18 - Boaz, 2026-10-08)</w:t>
+      </w:r>
+    </w:p>
+    <w:p>
+      <w:pPr>
+        <w:pStyle w:val="Heading3"/>
+      </w:pPr>
+      <w:r>
+        <w:rPr>
+          <w:b w:val="0"/>
+        </w:rPr>
+        <w:t>10a.1 The Team Lead invites (D17)</w:t>
+      </w:r>
+    </w:p>
+    <w:p>
+      <w:pPr>
+        <w:pStyle w:val="ListBullet"/>
+      </w:pPr>
+      <w:r>
+        <w:rPr>
+          <w:b w:val="0"/>
+        </w:rPr>
+        <w:t xml:space="preserve">Settings &gt; Team, below the members table: </w:t>
+      </w:r>
+      <w:r>
+        <w:rPr>
+          <w:b/>
+        </w:rPr>
+        <w:t>Add member…</w:t>
+      </w:r>
+      <w:r>
+        <w:rPr>
+          <w:b w:val="0"/>
+        </w:rPr>
+        <w:t xml:space="preserve"> (Team Lead and deputy). The dialog asks for the</w:t>
+      </w:r>
+    </w:p>
+    <w:p>
+      <w:r>
+        <w:rPr>
+          <w:b w:val="0"/>
+        </w:rPr>
+        <w:t xml:space="preserve">  colleague's </w:t>
+      </w:r>
+      <w:r>
+        <w:rPr>
+          <w:b/>
+        </w:rPr>
+        <w:t>name</w:t>
+      </w:r>
+      <w:r>
+        <w:rPr>
+          <w:b w:val="0"/>
+        </w:rPr>
+        <w:t xml:space="preserve">, their </w:t>
+      </w:r>
+      <w:r>
+        <w:rPr>
+          <w:b/>
+        </w:rPr>
+        <w:t>e-mail</w:t>
+      </w:r>
+      <w:r>
+        <w:rPr>
+          <w:b w:val="0"/>
+        </w:rPr>
+        <w:t xml:space="preserve"> (only shown, to tell two people of the same name apart) and their </w:t>
+      </w:r>
+      <w:r>
+        <w:rPr>
+          <w:b/>
+        </w:rPr>
+        <w:t>groups</w:t>
+      </w:r>
+    </w:p>
+    <w:p>
+      <w:r>
+        <w:rPr>
+          <w:b w:val="0"/>
+        </w:rPr>
+        <w:t xml:space="preserve">  (ticks; none = Other, D9). Save writes </w:t>
+      </w:r>
+      <w:r>
+        <w:rPr>
+          <w:rFonts w:ascii="Consolas" w:hAnsi="Consolas"/>
+          <w:b w:val="0"/>
+        </w:rPr>
+        <w:t>invites/&lt;invite id&gt;.json</w:t>
+      </w:r>
+      <w:r>
+        <w:rPr>
+          <w:b w:val="0"/>
+        </w:rPr>
+        <w:t xml:space="preserve"> into the team folder:</w:t>
+      </w:r>
+    </w:p>
+    <w:p>
+      <w:r>
+        <w:rPr>
+          <w:b w:val="0"/>
+        </w:rPr>
+        <w:t xml:space="preserve">  </w:t>
+      </w:r>
+      <w:r>
+        <w:rPr>
+          <w:rFonts w:ascii="Consolas" w:hAnsi="Consolas"/>
+          <w:b w:val="0"/>
+        </w:rPr>
+        <w:t>{ member: "m-&lt;reserved id&gt;", name, email, by, at }</w:t>
+      </w:r>
+      <w:r>
+        <w:rPr>
+          <w:b w:val="0"/>
+        </w:rPr>
+        <w:t>.</w:t>
+      </w:r>
+    </w:p>
+    <w:p>
+      <w:pPr>
+        <w:pStyle w:val="ListBullet"/>
+      </w:pPr>
+      <w:r>
+        <w:rPr>
+          <w:b w:val="0"/>
+        </w:rPr>
+        <w:t xml:space="preserve">The member id is </w:t>
+      </w:r>
+      <w:r>
+        <w:rPr>
+          <w:b/>
+        </w:rPr>
+        <w:t>reserved</w:t>
+      </w:r>
+      <w:r>
+        <w:rPr>
+          <w:b w:val="0"/>
+        </w:rPr>
+        <w:t xml:space="preserve"> in the invitation, so the Team Lead can put the colleague into groups straight away:</w:t>
+      </w:r>
+    </w:p>
+    <w:p>
+      <w:r>
+        <w:rPr>
+          <w:b w:val="0"/>
+        </w:rPr>
+        <w:t xml:space="preserve">  the group rows simply list that id. It counts as a member only once it has joined (</w:t>
+      </w:r>
+      <w:r>
+        <w:rPr>
+          <w:rFonts w:ascii="Consolas" w:hAnsi="Consolas"/>
+          <w:b w:val="0"/>
+        </w:rPr>
+        <w:t>groupIndex</w:t>
+      </w:r>
+      <w:r>
+        <w:rPr>
+          <w:b w:val="0"/>
+        </w:rPr>
+        <w:t xml:space="preserve"> is given the</w:t>
+      </w:r>
+    </w:p>
+    <w:p>
+      <w:r>
+        <w:rPr>
+          <w:b w:val="0"/>
+        </w:rPr>
+        <w:t xml:space="preserve">  current team), so nothing is visible to anyone before that.</w:t>
+      </w:r>
+    </w:p>
+    <w:p>
+      <w:pPr>
+        <w:pStyle w:val="ListBullet"/>
+      </w:pPr>
+      <w:r>
+        <w:rPr>
+          <w:b w:val="0"/>
+        </w:rPr>
+        <w:t xml:space="preserve">The members table lists them as </w:t>
+      </w:r>
+      <w:r>
+        <w:rPr>
+          <w:b/>
+        </w:rPr>
+        <w:t>Invited</w:t>
+      </w:r>
+      <w:r>
+        <w:rPr>
+          <w:b w:val="0"/>
+        </w:rPr>
+        <w:t xml:space="preserve"> (name, e-mail, groups, "invited 8 Oct by Boaz"). Their ⋮ has</w:t>
+      </w:r>
+    </w:p>
+    <w:p>
+      <w:r>
+        <w:rPr>
+          <w:b w:val="0"/>
+        </w:rPr>
+        <w:t xml:space="preserve">  </w:t>
+      </w:r>
+      <w:r>
+        <w:rPr>
+          <w:b/>
+        </w:rPr>
+        <w:t>Groups…</w:t>
+      </w:r>
+      <w:r>
+        <w:rPr>
+          <w:b w:val="0"/>
+        </w:rPr>
+        <w:t xml:space="preserve"> and </w:t>
+      </w:r>
+      <w:r>
+        <w:rPr>
+          <w:b/>
+        </w:rPr>
+        <w:t>Cancel invitation…</w:t>
+      </w:r>
+      <w:r>
+        <w:rPr>
+          <w:b w:val="0"/>
+        </w:rPr>
+        <w:t xml:space="preserve"> (the file is marked cancelled, not deleted, so a late join is refused).</w:t>
+      </w:r>
+    </w:p>
+    <w:p>
+      <w:pPr>
+        <w:pStyle w:val="ListBullet"/>
+      </w:pPr>
+      <w:r>
+        <w:rPr>
+          <w:b w:val="0"/>
+        </w:rPr>
+        <w:t>The Team Lead still shares the folder in OneDrive (right-click &gt; Share, "Can edit") - SalesTeam cannot do that.</w:t>
+      </w:r>
+    </w:p>
+    <w:p>
+      <w:r>
+        <w:rPr>
+          <w:b w:val="0"/>
+        </w:rPr>
+        <w:t xml:space="preserve">  The dialog's last line says so, with the folder's name.</w:t>
+      </w:r>
+    </w:p>
+    <w:p>
+      <w:pPr>
+        <w:pStyle w:val="Heading3"/>
+      </w:pPr>
+      <w:r>
+        <w:rPr>
+          <w:b w:val="0"/>
+        </w:rPr>
+        <w:t>10a.2 The member accepts</w:t>
+      </w:r>
+    </w:p>
+    <w:p>
+      <w:pPr>
+        <w:pStyle w:val="ListBullet"/>
+      </w:pPr>
+      <w:r>
+        <w:rPr>
+          <w:b w:val="0"/>
+        </w:rPr>
+        <w:t>Join a team, after the team is chosen (10a.3): SalesTeam reads the open invitations and shows them -</w:t>
+      </w:r>
+    </w:p>
+    <w:p>
+      <w:r>
+        <w:rPr>
+          <w:b w:val="0"/>
+        </w:rPr>
+        <w:t xml:space="preserve">  "Boaz invited: </w:t>
+      </w:r>
+      <w:r>
+        <w:rPr>
+          <w:b/>
+        </w:rPr>
+        <w:t>Annick Zutter</w:t>
+      </w:r>
+      <w:r>
+        <w:rPr>
+          <w:b w:val="0"/>
+        </w:rPr>
+        <w:t xml:space="preserve"> (anna@…) - groups EMEA, VIP". The one whose name matches the User Profile name</w:t>
+      </w:r>
+    </w:p>
+    <w:p>
+      <w:r>
+        <w:rPr>
+          <w:b w:val="0"/>
+        </w:rPr>
+        <w:t xml:space="preserve">  is preselected. </w:t>
+      </w:r>
+      <w:r>
+        <w:rPr>
+          <w:b/>
+        </w:rPr>
+        <w:t>Join as Annick Zutter</w:t>
+      </w:r>
+      <w:r>
+        <w:rPr>
+          <w:b w:val="0"/>
+        </w:rPr>
+        <w:t xml:space="preserve"> joins with the reserved id, the name from the invitation and the groups</w:t>
+      </w:r>
+    </w:p>
+    <w:p>
+      <w:r>
+        <w:rPr>
+          <w:b w:val="0"/>
+        </w:rPr>
+        <w:t xml:space="preserve">  already set. The backup and the "accounts to bring" question stay as today.</w:t>
+      </w:r>
+    </w:p>
+    <w:p>
+      <w:pPr>
+        <w:pStyle w:val="ListBullet"/>
+      </w:pPr>
+      <w:r>
+        <w:rPr>
+          <w:b w:val="0"/>
+        </w:rPr>
+        <w:t xml:space="preserve">The PC writes </w:t>
+      </w:r>
+      <w:r>
+        <w:rPr>
+          <w:rFonts w:ascii="Consolas" w:hAnsi="Consolas"/>
+          <w:b w:val="0"/>
+        </w:rPr>
+        <w:t>invites/&lt;id&gt;.json</w:t>
+      </w:r>
+      <w:r>
+        <w:rPr>
+          <w:b w:val="0"/>
+        </w:rPr>
+        <w:t xml:space="preserve"> back as accepted (with the time). An invitation that is accepted or cancelled</w:t>
+      </w:r>
+    </w:p>
+    <w:p>
+      <w:r>
+        <w:rPr>
+          <w:b w:val="0"/>
+        </w:rPr>
+        <w:t xml:space="preserve">  is not offered again; two PCs accepting the same one at once: the member folder of the reserved id already</w:t>
+      </w:r>
+    </w:p>
+    <w:p>
+      <w:r>
+        <w:rPr>
+          <w:b w:val="0"/>
+        </w:rPr>
+        <w:t xml:space="preserve">  exists for the second, which is refused with "This invitation has just been used on another PC".</w:t>
+      </w:r>
+    </w:p>
+    <w:p>
+      <w:pPr>
+        <w:pStyle w:val="ListBullet"/>
+      </w:pPr>
+      <w:r>
+        <w:rPr>
+          <w:b/>
+        </w:rPr>
+        <w:t>Without an invitation</w:t>
+      </w:r>
+      <w:r>
+        <w:rPr>
+          <w:b w:val="0"/>
+        </w:rPr>
+        <w:t xml:space="preserve"> (D17 question below): proposal - joining still works as today; the newcomer is in Other</w:t>
+      </w:r>
+    </w:p>
+    <w:p>
+      <w:r>
+        <w:rPr>
+          <w:b w:val="0"/>
+        </w:rPr>
+        <w:t xml:space="preserve">  (D9) and the Team Lead gets a top-bar notice "Fay joined without an invitation - add her to groups?".</w:t>
+      </w:r>
+    </w:p>
+    <w:p>
+      <w:pPr>
+        <w:pStyle w:val="Heading3"/>
+      </w:pPr>
+      <w:r>
+        <w:rPr>
+          <w:b w:val="0"/>
+        </w:rPr>
+        <w:t>10a.3 Choosing the team from a list instead of a folder (D18)</w:t>
+      </w:r>
+    </w:p>
+    <w:p>
+      <w:pPr>
+        <w:pStyle w:val="ListBullet"/>
+      </w:pPr>
+      <w:r>
+        <w:rPr>
+          <w:b w:val="0"/>
+        </w:rPr>
+        <w:t>Chrome lets SalesTeam use a folder only after the person picked it once. So the first time, Join and Create ask</w:t>
+      </w:r>
+    </w:p>
+    <w:p>
+      <w:r>
+        <w:rPr>
+          <w:b w:val="0"/>
+        </w:rPr>
+        <w:t xml:space="preserve">  for the </w:t>
+      </w:r>
+      <w:r>
+        <w:rPr>
+          <w:b/>
+        </w:rPr>
+        <w:t>OneDrive folder itself</w:t>
+      </w:r>
+      <w:r>
+        <w:rPr>
+          <w:b w:val="0"/>
+        </w:rPr>
+        <w:t xml:space="preserve"> ("Choose your OneDrive folder" - the step-by-step text names it, e.g.</w:t>
+      </w:r>
+    </w:p>
+    <w:p>
+      <w:r>
+        <w:rPr>
+          <w:b w:val="0"/>
+        </w:rPr>
+        <w:t xml:space="preserve">  "OneDrive - TimeToAct"), with "Allow on every visit". SalesTeam keeps that permission.</w:t>
+      </w:r>
+    </w:p>
+    <w:p>
+      <w:pPr>
+        <w:pStyle w:val="ListBullet"/>
+      </w:pPr>
+      <w:r>
+        <w:rPr>
+          <w:b/>
+        </w:rPr>
+        <w:t>Join:</w:t>
+      </w:r>
+      <w:r>
+        <w:rPr>
+          <w:b w:val="0"/>
+        </w:rPr>
+        <w:t xml:space="preserve"> SalesTeam looks one level down for folders holding a </w:t>
+      </w:r>
+      <w:r>
+        <w:rPr>
+          <w:rFonts w:ascii="Consolas" w:hAnsi="Consolas"/>
+          <w:b w:val="0"/>
+        </w:rPr>
+        <w:t>team.json</w:t>
+      </w:r>
+      <w:r>
+        <w:rPr>
+          <w:b w:val="0"/>
+        </w:rPr>
+        <w:t xml:space="preserve"> (a shared folder added with "Add</w:t>
+      </w:r>
+    </w:p>
+    <w:p>
+      <w:r>
+        <w:rPr>
+          <w:b w:val="0"/>
+        </w:rPr>
+        <w:t xml:space="preserve">  shortcut to My files" appears there) and shows a dropdown: </w:t>
+      </w:r>
+      <w:r>
+        <w:rPr>
+          <w:b/>
+        </w:rPr>
+        <w:t>TimeToAct2 - created by Boaz, 5 Oct</w:t>
+      </w:r>
+      <w:r>
+        <w:rPr>
+          <w:b w:val="0"/>
+        </w:rPr>
+        <w:t>. Choosing one</w:t>
+      </w:r>
+    </w:p>
+    <w:p>
+      <w:r>
+        <w:rPr>
+          <w:b w:val="0"/>
+        </w:rPr>
+        <w:t xml:space="preserve">  is all; no folder picking. None found: "No team found in OneDrive yet - has the folder been shared with you and</w:t>
+      </w:r>
+    </w:p>
+    <w:p>
+      <w:r>
+        <w:rPr>
+          <w:b w:val="0"/>
+        </w:rPr>
+        <w:t xml:space="preserve">  added to My files? It can take a minute to appear." and a Look again button.</w:t>
+      </w:r>
+    </w:p>
+    <w:p>
+      <w:pPr>
+        <w:pStyle w:val="ListBullet"/>
+      </w:pPr>
+      <w:r>
+        <w:rPr>
+          <w:b/>
+        </w:rPr>
+        <w:t>Create:</w:t>
+      </w:r>
+      <w:r>
+        <w:rPr>
+          <w:b w:val="0"/>
+        </w:rPr>
+        <w:t xml:space="preserve"> the team name is typed as today; SalesTeam creates the folder </w:t>
+      </w:r>
+      <w:r>
+        <w:rPr>
+          <w:rFonts w:ascii="Consolas" w:hAnsi="Consolas"/>
+          <w:b w:val="0"/>
+        </w:rPr>
+        <w:t>SalesTeam - &lt;team name&gt;</w:t>
+      </w:r>
+      <w:r>
+        <w:rPr>
+          <w:b w:val="0"/>
+        </w:rPr>
+        <w:t xml:space="preserve"> in OneDrive</w:t>
+      </w:r>
+    </w:p>
+    <w:p>
+      <w:r>
+        <w:rPr>
+          <w:b w:val="0"/>
+        </w:rPr>
+        <w:t xml:space="preserve">  itself (no empty folder to make by hand). Sharing it stays the Team Lead's step in OneDrive.</w:t>
+      </w:r>
+    </w:p>
+    <w:p>
+      <w:pPr>
+        <w:pStyle w:val="ListBullet"/>
+      </w:pPr>
+      <w:r>
+        <w:rPr>
+          <w:b w:val="0"/>
+        </w:rPr>
+        <w:t>Fallback: "Choose a folder instead…" keeps today's folder picker, for a team folder that is not directly in</w:t>
+      </w:r>
+    </w:p>
+    <w:p>
+      <w:r>
+        <w:rPr>
+          <w:b w:val="0"/>
+        </w:rPr>
+        <w:t xml:space="preserve">  OneDrive.</w:t>
+      </w:r>
+    </w:p>
+    <w:p>
+      <w:pPr>
+        <w:pStyle w:val="ListBullet"/>
+      </w:pPr>
+      <w:r>
+        <w:rPr>
+          <w:b w:val="0"/>
+        </w:rPr>
+        <w:t>The team folder is then reached through the OneDrive folder; reconnecting after a Chrome restart asks for the</w:t>
+      </w:r>
+    </w:p>
+    <w:p>
+      <w:r>
+        <w:rPr>
+          <w:b w:val="0"/>
+        </w:rPr>
+        <w:t xml:space="preserve">  OneDrive folder once, as it asks for the team folder today.</w:t>
+      </w:r>
+    </w:p>
+    <w:p>
+      <w:pPr>
+        <w:pStyle w:val="Heading2"/>
+      </w:pPr>
+      <w:r>
+        <w:rPr>
+          <w:b w:val="0"/>
+        </w:rPr>
         <w:t>11. Notices and team log (R3.4, R10.3)</w:t>
       </w:r>
     </w:p>
@@ -7105,6 +7683,69 @@
               <w:rPr>
                 <w:b w:val="0"/>
               </w:rPr>
+              <w:t>1b</w:t>
+            </w:r>
+          </w:p>
+        </w:tc>
+        <w:tc>
+          <w:tcPr>
+            <w:tcW w:type="dxa" w:w="2880"/>
+          </w:tcPr>
+          <w:p>
+            <w:r/>
+            <w:r>
+              <w:rPr>
+                <w:b/>
+              </w:rPr>
+              <w:t>Invitations and the team list (D17, D18).</w:t>
+            </w:r>
+            <w:r>
+              <w:rPr>
+                <w:b w:val="0"/>
+              </w:rPr>
+              <w:t xml:space="preserve"> Add member… (name, e-mail, groups) writes an invitation with a reserved member id; the members table shows "Invited" with ⋮ Cancel invitation; Join and Create start from "Choose your OneDrive folder" once, then a dropdown of the teams found there; joining shows the open invitations, the member picks theirs and joins with name and groups already set. </w:t>
+            </w:r>
+            <w:r>
+              <w:rPr>
+                <w:rFonts w:ascii="Consolas" w:hAnsi="Consolas"/>
+                <w:b w:val="0"/>
+              </w:rPr>
+              <w:t>test_team_sync.py</w:t>
+            </w:r>
+            <w:r>
+              <w:rPr>
+                <w:b w:val="0"/>
+              </w:rPr>
+              <w:t>: invited member joins with their reserved id and is in their groups at once; an invitation cannot be used twice.</w:t>
+            </w:r>
+          </w:p>
+        </w:tc>
+        <w:tc>
+          <w:tcPr>
+            <w:tcW w:type="dxa" w:w="2880"/>
+          </w:tcPr>
+          <w:p>
+            <w:r/>
+            <w:r>
+              <w:rPr>
+                <w:b w:val="0"/>
+              </w:rPr>
+              <w:t>1.2.2.8</w:t>
+            </w:r>
+          </w:p>
+        </w:tc>
+      </w:tr>
+      <w:tr>
+        <w:tc>
+          <w:tcPr>
+            <w:tcW w:type="dxa" w:w="2880"/>
+          </w:tcPr>
+          <w:p>
+            <w:r/>
+            <w:r>
+              <w:rPr>
+                <w:b w:val="0"/>
+              </w:rPr>
               <w:t>2</w:t>
             </w:r>
           </w:p>
@@ -7152,7 +7793,7 @@
               <w:rPr>
                 <w:b w:val="0"/>
               </w:rPr>
-              <w:t>1.2.2.8</w:t>
+              <w:t>1.2.2.9</w:t>
             </w:r>
           </w:p>
         </w:tc>
@@ -7202,7 +7843,7 @@
               <w:rPr>
                 <w:b w:val="0"/>
               </w:rPr>
-              <w:t>1.2.2.9</w:t>
+              <w:t>1.2.2.10</w:t>
             </w:r>
           </w:p>
         </w:tc>
@@ -7278,7 +7919,7 @@
               <w:rPr>
                 <w:b w:val="0"/>
               </w:rPr>
-              <w:t>1.2.2.10</w:t>
+              <w:t>1.2.2.11</w:t>
             </w:r>
           </w:p>
         </w:tc>
@@ -7354,7 +7995,7 @@
               <w:rPr>
                 <w:b w:val="0"/>
               </w:rPr>
-              <w:t>1.2.2.11</w:t>
+              <w:t>1.2.2.12</w:t>
             </w:r>
           </w:p>
         </w:tc>
@@ -8605,6 +9246,88 @@
           <w:b/>
         </w:rPr>
         <w:t>Answer 2026-10-08: agreed as proposed.</w:t>
+      </w:r>
+    </w:p>
+    <w:p>
+      <w:pPr>
+        <w:pStyle w:val="ListBullet"/>
+      </w:pPr>
+      <w:r>
+        <w:rPr>
+          <w:b/>
+        </w:rPr>
+        <w:t>D17 — Invitations (Boaz, 2026-10-08: in 1.2.3, not later).</w:t>
+      </w:r>
+      <w:r>
+        <w:rPr>
+          <w:b w:val="0"/>
+        </w:rPr>
+        <w:t xml:space="preserve"> The Team Lead adds a member by name, e-mail and</w:t>
+      </w:r>
+    </w:p>
+    <w:p>
+      <w:r>
+        <w:rPr>
+          <w:b w:val="0"/>
+        </w:rPr>
+        <w:t xml:space="preserve">  groups; the member accepts on their PC with one click (10a.1, 10a.2). Open question: **may someone still join</w:t>
+      </w:r>
+    </w:p>
+    <w:p>
+      <w:r>
+        <w:rPr>
+          <w:b w:val="0"/>
+        </w:rPr>
+        <w:t xml:space="preserve">  without an invitation?** Proposal: yes - they land in Other and the Team Lead is told (the folder's OneDrive</w:t>
+      </w:r>
+    </w:p>
+    <w:p>
+      <w:r>
+        <w:rPr>
+          <w:b w:val="0"/>
+        </w:rPr>
+        <w:t xml:space="preserve">  sharing already decides who can reach it). Alternative: invitation required - a member without one is refused</w:t>
+      </w:r>
+    </w:p>
+    <w:p>
+      <w:r>
+        <w:rPr>
+          <w:b w:val="0"/>
+        </w:rPr>
+        <w:t xml:space="preserve">  with "Ask your Team Lead for an invitation".</w:t>
+      </w:r>
+    </w:p>
+    <w:p>
+      <w:pPr>
+        <w:pStyle w:val="ListBullet"/>
+      </w:pPr>
+      <w:r>
+        <w:rPr>
+          <w:b/>
+        </w:rPr>
+        <w:t>D18 — Team from a list (Boaz, 2026-10-08).</w:t>
+      </w:r>
+      <w:r>
+        <w:rPr>
+          <w:b w:val="0"/>
+        </w:rPr>
+        <w:t xml:space="preserve"> Join and Create start from the OneDrive folder, chosen once;</w:t>
+      </w:r>
+    </w:p>
+    <w:p>
+      <w:r>
+        <w:rPr>
+          <w:b w:val="0"/>
+        </w:rPr>
+        <w:t xml:space="preserve">  joining picks the team from a dropdown, creating makes the team folder itself (10a.3). Agree, including</w:t>
+      </w:r>
+    </w:p>
+    <w:p>
+      <w:r>
+        <w:rPr>
+          <w:b w:val="0"/>
+        </w:rPr>
+        <w:t xml:space="preserve">  SalesTeam creating the team folder on Create?</w:t>
       </w:r>
     </w:p>
     <w:sectPr>

</xml_diff>

<commit_message>
1.2.3 design: D17/D18 answered - invitations without groups, no joining without an invitation, SalesTeam creates the team folder
Co-Authored-By: Claude Opus 5.5 <noreply@anthropic.com>
</commit_message>
<xml_diff>
--- a/TEAM_ADVANCED_MODE_DESIGN.docx
+++ b/TEAM_ADVANCED_MODE_DESIGN.docx
@@ -50,7 +50,7 @@
         <w:rPr>
           <w:b w:val="0"/>
         </w:rPr>
-        <w:t xml:space="preserve"> All decisions D1–D15 answered (section 13).</w:t>
+        <w:t xml:space="preserve"> All decisions D1–D18 answered (section 13).</w:t>
       </w:r>
     </w:p>
     <w:p>
@@ -6569,7 +6569,7 @@
         <w:rPr>
           <w:b w:val="0"/>
         </w:rPr>
-        <w:t xml:space="preserve">, their </w:t>
+        <w:t xml:space="preserve"> and </w:t>
       </w:r>
       <w:r>
         <w:rPr>
@@ -6581,21 +6581,15 @@
         <w:rPr>
           <w:b w:val="0"/>
         </w:rPr>
-        <w:t xml:space="preserve"> (only shown, to tell two people of the same name apart) and their </w:t>
-      </w:r>
-      <w:r>
-        <w:rPr>
-          <w:b/>
-        </w:rPr>
-        <w:t>groups</w:t>
-      </w:r>
-    </w:p>
-    <w:p>
-      <w:r>
-        <w:rPr>
-          <w:b w:val="0"/>
-        </w:rPr>
-        <w:t xml:space="preserve">  (ticks; none = Other, D9). Save writes </w:t>
+        <w:t xml:space="preserve"> (the e-mail is only shown, to tell two people of the same name apart). Save</w:t>
+      </w:r>
+    </w:p>
+    <w:p>
+      <w:r>
+        <w:rPr>
+          <w:b w:val="0"/>
+        </w:rPr>
+        <w:t xml:space="preserve">  writes </w:t>
       </w:r>
       <w:r>
         <w:rPr>
@@ -6608,22 +6602,14 @@
         <w:rPr>
           <w:b w:val="0"/>
         </w:rPr>
-        <w:t xml:space="preserve"> into the team folder:</w:t>
-      </w:r>
-    </w:p>
-    <w:p>
-      <w:r>
-        <w:rPr>
-          <w:b w:val="0"/>
-        </w:rPr>
-        <w:t xml:space="preserve">  </w:t>
+        <w:t xml:space="preserve"> into the team folder: </w:t>
       </w:r>
       <w:r>
         <w:rPr>
           <w:rFonts w:ascii="Consolas" w:hAnsi="Consolas"/>
           <w:b w:val="0"/>
         </w:rPr>
-        <w:t>{ member: "m-&lt;reserved id&gt;", name, email, by, at }</w:t>
+        <w:t>{ name, email, by, at }</w:t>
       </w:r>
       <w:r>
         <w:rPr>
@@ -6638,50 +6624,23 @@
       </w:pPr>
       <w:r>
         <w:rPr>
-          <w:b w:val="0"/>
-        </w:rPr>
-        <w:t xml:space="preserve">The member id is </w:t>
-      </w:r>
-      <w:r>
-        <w:rPr>
           <w:b/>
         </w:rPr>
-        <w:t>reserved</w:t>
-      </w:r>
-      <w:r>
-        <w:rPr>
-          <w:b w:val="0"/>
-        </w:rPr>
-        <w:t xml:space="preserve"> in the invitation, so the Team Lead can put the colleague into groups straight away:</w:t>
-      </w:r>
-    </w:p>
-    <w:p>
-      <w:r>
-        <w:rPr>
-          <w:b w:val="0"/>
-        </w:rPr>
-        <w:t xml:space="preserve">  the group rows simply list that id. It counts as a member only once it has joined (</w:t>
-      </w:r>
-      <w:r>
-        <w:rPr>
-          <w:rFonts w:ascii="Consolas" w:hAnsi="Consolas"/>
-          <w:b w:val="0"/>
-        </w:rPr>
-        <w:t>groupIndex</w:t>
-      </w:r>
-      <w:r>
-        <w:rPr>
-          <w:b w:val="0"/>
-        </w:rPr>
-        <w:t xml:space="preserve"> is given the</w:t>
-      </w:r>
-    </w:p>
-    <w:p>
-      <w:r>
-        <w:rPr>
-          <w:b w:val="0"/>
-        </w:rPr>
-        <w:t xml:space="preserve">  current team), so nothing is visible to anyone before that.</w:t>
+        <w:t>No groups in the invitation</w:t>
+      </w:r>
+      <w:r>
+        <w:rPr>
+          <w:b w:val="0"/>
+        </w:rPr>
+        <w:t xml:space="preserve"> (Boaz, 2026-10-08 - simpler): after the colleague has joined, the Team Lead puts</w:t>
+      </w:r>
+    </w:p>
+    <w:p>
+      <w:r>
+        <w:rPr>
+          <w:b w:val="0"/>
+        </w:rPr>
+        <w:t xml:space="preserve">  them into groups like any member (⋮ Groups…). Until then they are in Other (D9).</w:t>
       </w:r>
     </w:p>
     <w:p>
@@ -6704,39 +6663,15 @@
         <w:rPr>
           <w:b w:val="0"/>
         </w:rPr>
-        <w:t xml:space="preserve"> (name, e-mail, groups, "invited 8 Oct by Boaz"). Their ⋮ has</w:t>
-      </w:r>
-    </w:p>
-    <w:p>
-      <w:r>
-        <w:rPr>
-          <w:b w:val="0"/>
-        </w:rPr>
-        <w:t xml:space="preserve">  </w:t>
-      </w:r>
-      <w:r>
-        <w:rPr>
-          <w:b/>
-        </w:rPr>
-        <w:t>Groups…</w:t>
-      </w:r>
-      <w:r>
-        <w:rPr>
-          <w:b w:val="0"/>
-        </w:rPr>
-        <w:t xml:space="preserve"> and </w:t>
-      </w:r>
-      <w:r>
-        <w:rPr>
-          <w:b/>
-        </w:rPr>
-        <w:t>Cancel invitation…</w:t>
-      </w:r>
-      <w:r>
-        <w:rPr>
-          <w:b w:val="0"/>
-        </w:rPr>
-        <w:t xml:space="preserve"> (the file is marked cancelled, not deleted, so a late join is refused).</w:t>
+        <w:t xml:space="preserve"> (name, e-mail, "invited 8 Oct by Boaz"). Their ⋮ has **Cancel</w:t>
+      </w:r>
+    </w:p>
+    <w:p>
+      <w:r>
+        <w:rPr>
+          <w:b w:val="0"/>
+        </w:rPr>
+        <w:t xml:space="preserve">  invitation…** (the file is marked cancelled, not deleted, so a late join is refused).</w:t>
       </w:r>
     </w:p>
     <w:p>
@@ -6797,15 +6732,15 @@
         <w:rPr>
           <w:b w:val="0"/>
         </w:rPr>
-        <w:t xml:space="preserve"> (anna@…) - groups EMEA, VIP". The one whose name matches the User Profile name</w:t>
-      </w:r>
-    </w:p>
-    <w:p>
-      <w:r>
-        <w:rPr>
-          <w:b w:val="0"/>
-        </w:rPr>
-        <w:t xml:space="preserve">  is preselected. </w:t>
+        <w:t xml:space="preserve"> (anna@…)". The one whose name matches the User Profile name is preselected.</w:t>
+      </w:r>
+    </w:p>
+    <w:p>
+      <w:r>
+        <w:rPr>
+          <w:b w:val="0"/>
+        </w:rPr>
+        <w:t xml:space="preserve">  </w:t>
       </w:r>
       <w:r>
         <w:rPr>
@@ -6817,15 +6752,15 @@
         <w:rPr>
           <w:b w:val="0"/>
         </w:rPr>
-        <w:t xml:space="preserve"> joins with the reserved id, the name from the invitation and the groups</w:t>
-      </w:r>
-    </w:p>
-    <w:p>
-      <w:r>
-        <w:rPr>
-          <w:b w:val="0"/>
-        </w:rPr>
-        <w:t xml:space="preserve">  already set. The backup and the "accounts to bring" question stay as today.</w:t>
+        <w:t xml:space="preserve"> joins with the name from the invitation. The backup and the "accounts to bring" question</w:t>
+      </w:r>
+    </w:p>
+    <w:p>
+      <w:r>
+        <w:rPr>
+          <w:b w:val="0"/>
+        </w:rPr>
+        <w:t xml:space="preserve">  stay as today.</w:t>
       </w:r>
     </w:p>
     <w:p>
@@ -6857,15 +6792,15 @@
         <w:rPr>
           <w:b w:val="0"/>
         </w:rPr>
-        <w:t xml:space="preserve">  is not offered again; two PCs accepting the same one at once: the member folder of the reserved id already</w:t>
-      </w:r>
-    </w:p>
-    <w:p>
-      <w:r>
-        <w:rPr>
-          <w:b w:val="0"/>
-        </w:rPr>
-        <w:t xml:space="preserve">  exists for the second, which is refused with "This invitation has just been used on another PC".</w:t>
+        <w:t xml:space="preserve">  is not offered again; two PCs accepting the same one at once: the later acceptance is refused with "This</w:t>
+      </w:r>
+    </w:p>
+    <w:p>
+      <w:r>
+        <w:rPr>
+          <w:b w:val="0"/>
+        </w:rPr>
+        <w:t xml:space="preserve">  invitation has just been used on another PC".</w:t>
       </w:r>
     </w:p>
     <w:p>
@@ -6876,21 +6811,48 @@
         <w:rPr>
           <w:b/>
         </w:rPr>
-        <w:t>Without an invitation</w:t>
-      </w:r>
-      <w:r>
-        <w:rPr>
-          <w:b w:val="0"/>
-        </w:rPr>
-        <w:t xml:space="preserve"> (D17 question below): proposal - joining still works as today; the newcomer is in Other</w:t>
-      </w:r>
-    </w:p>
-    <w:p>
-      <w:r>
-        <w:rPr>
-          <w:b w:val="0"/>
-        </w:rPr>
-        <w:t xml:space="preserve">  (D9) and the Team Lead gets a top-bar notice "Fay joined without an invitation - add her to groups?".</w:t>
+        <w:t>No joining without an invitation</w:t>
+      </w:r>
+      <w:r>
+        <w:rPr>
+          <w:b w:val="0"/>
+        </w:rPr>
+        <w:t xml:space="preserve"> (Boaz, 2026-10-08 - the Team Lead controls who is in the team): a team with no</w:t>
+      </w:r>
+    </w:p>
+    <w:p>
+      <w:r>
+        <w:rPr>
+          <w:b w:val="0"/>
+        </w:rPr>
+        <w:t xml:space="preserve">  open invitation for this person is not offered. Chosen by folder (fallback), it is refused with "There is no</w:t>
+      </w:r>
+    </w:p>
+    <w:p>
+      <w:r>
+        <w:rPr>
+          <w:b w:val="0"/>
+        </w:rPr>
+        <w:t xml:space="preserve">  invitation for you in this team. Ask the Team Lead to add you (Settings &gt; Team &gt; Add member…)."</w:t>
+      </w:r>
+    </w:p>
+    <w:p>
+      <w:pPr>
+        <w:pStyle w:val="ListBullet"/>
+      </w:pPr>
+      <w:r>
+        <w:rPr>
+          <w:b w:val="0"/>
+        </w:rPr>
+        <w:t>The Team Lead gets a top-bar notice when an invitation is accepted: "Annick Zutter joined the team - add her to</w:t>
+      </w:r>
+    </w:p>
+    <w:p>
+      <w:r>
+        <w:rPr>
+          <w:b w:val="0"/>
+        </w:rPr>
+        <w:t xml:space="preserve">  groups?".</w:t>
       </w:r>
     </w:p>
     <w:p>
@@ -6978,27 +6940,39 @@
         <w:rPr>
           <w:b w:val="0"/>
         </w:rPr>
-        <w:t xml:space="preserve">  shortcut to My files" appears there) and shows a dropdown: </w:t>
+        <w:t xml:space="preserve">  shortcut to My files" appears there) and shows a dropdown of the teams </w:t>
       </w:r>
       <w:r>
         <w:rPr>
           <w:b/>
         </w:rPr>
+        <w:t>with an open invitation for this person</w:t>
+      </w:r>
+      <w:r>
+        <w:rPr>
+          <w:b w:val="0"/>
+        </w:rPr>
+        <w:t>:</w:t>
+      </w:r>
+    </w:p>
+    <w:p>
+      <w:r>
+        <w:rPr>
+          <w:b w:val="0"/>
+        </w:rPr>
+        <w:t xml:space="preserve">  </w:t>
+      </w:r>
+      <w:r>
+        <w:rPr>
+          <w:b/>
+        </w:rPr>
         <w:t>TimeToAct2 - created by Boaz, 5 Oct</w:t>
       </w:r>
       <w:r>
         <w:rPr>
           <w:b w:val="0"/>
         </w:rPr>
-        <w:t>. Choosing one</w:t>
-      </w:r>
-    </w:p>
-    <w:p>
-      <w:r>
-        <w:rPr>
-          <w:b w:val="0"/>
-        </w:rPr>
-        <w:t xml:space="preserve">  is all; no folder picking. None found: "No team found in OneDrive yet - has the folder been shared with you and</w:t>
+        <w:t>. Choosing one is all; no folder picking. None found: "No team found in OneDrive yet - has the folder been shared with you and</w:t>
       </w:r>
     </w:p>
     <w:p>
@@ -7703,7 +7677,7 @@
               <w:rPr>
                 <w:b w:val="0"/>
               </w:rPr>
-              <w:t xml:space="preserve"> Add member… (name, e-mail, groups) writes an invitation with a reserved member id; the members table shows "Invited" with ⋮ Cancel invitation; Join and Create start from "Choose your OneDrive folder" once, then a dropdown of the teams found there; joining shows the open invitations, the member picks theirs and joins with name and groups already set. </w:t>
+              <w:t xml:space="preserve"> Add member… (name, e-mail) writes an invitation; the members table shows "Invited" with ⋮ Cancel invitation; Join and Create start from "Choose your OneDrive folder" once; Join lists only teams with an invitation for this person, and refuses without one; Create makes the team folder itself. </w:t>
             </w:r>
             <w:r>
               <w:rPr>
@@ -7716,7 +7690,7 @@
               <w:rPr>
                 <w:b w:val="0"/>
               </w:rPr>
-              <w:t>: invited member joins with their reserved id and is in their groups at once; an invitation cannot be used twice.</w:t>
+              <w:t>: an invited member joins with the invitation's name; joining without an invitation is refused; an invitation cannot be used twice.</w:t>
             </w:r>
           </w:p>
         </w:tc>
@@ -9298,6 +9272,22 @@
       </w:r>
     </w:p>
     <w:p>
+      <w:r>
+        <w:rPr>
+          <w:b w:val="0"/>
+        </w:rPr>
+        <w:t xml:space="preserve">  **Answer 2026-10-08: invitations yes, with two changes - (1) no groups in the invitation: the Team Lead assigns</w:t>
+      </w:r>
+    </w:p>
+    <w:p>
+      <w:r>
+        <w:rPr>
+          <w:b w:val="0"/>
+        </w:rPr>
+        <w:t xml:space="preserve">  groups after the member has joined; (2) no joining without an invitation - the Team Lead controls everything.**</w:t>
+      </w:r>
+    </w:p>
+    <w:p>
       <w:pPr>
         <w:pStyle w:val="ListBullet"/>
       </w:pPr>
@@ -9328,6 +9318,20 @@
           <w:b w:val="0"/>
         </w:rPr>
         <w:t xml:space="preserve">  SalesTeam creating the team folder on Create?</w:t>
+      </w:r>
+    </w:p>
+    <w:p>
+      <w:r>
+        <w:rPr>
+          <w:b w:val="0"/>
+        </w:rPr>
+        <w:t xml:space="preserve">  </w:t>
+      </w:r>
+      <w:r>
+        <w:rPr>
+          <w:b/>
+        </w:rPr>
+        <w:t>Answer 2026-10-08: agreed, including SalesTeam creating the team folder.</w:t>
       </w:r>
     </w:p>
     <w:sectPr>

</xml_diff>

<commit_message>
1.2.3 design D16: Close the team also covers a team created by mistake
Co-Authored-By: Claude Opus 5.5 <noreply@anthropic.com>
</commit_message>
<xml_diff>
--- a/TEAM_ADVANCED_MODE_DESIGN.docx
+++ b/TEAM_ADVANCED_MODE_DESIGN.docx
@@ -9198,6 +9198,50 @@
           <w:b w:val="0"/>
         </w:rPr>
         <w:t xml:space="preserve">  - a Team Lead who wants to leave hands the role over first (Make Team Lead…) and then leaves as a Member.</w:t>
+      </w:r>
+    </w:p>
+    <w:p>
+      <w:r>
+        <w:rPr>
+          <w:b w:val="0"/>
+        </w:rPr>
+        <w:t xml:space="preserve">  - </w:t>
+      </w:r>
+      <w:r>
+        <w:rPr>
+          <w:b/>
+        </w:rPr>
+        <w:t>A team created by mistake</w:t>
+      </w:r>
+      <w:r>
+        <w:rPr>
+          <w:b w:val="0"/>
+        </w:rPr>
+        <w:t xml:space="preserve"> (Boaz, 2026-10-08 - e.g. the wrong folder, or a test): with no other member and no</w:t>
+      </w:r>
+    </w:p>
+    <w:p>
+      <w:r>
+        <w:rPr>
+          <w:b w:val="0"/>
+        </w:rPr>
+        <w:t xml:space="preserve">    accepted invitation, the confirm is short - "Close the team 'X'? Nobody else has joined it. Your data stays here</w:t>
+      </w:r>
+    </w:p>
+    <w:p>
+      <w:r>
+        <w:rPr>
+          <w:b w:val="0"/>
+        </w:rPr>
+        <w:t xml:space="preserve">    as it is." - and open invitations are cancelled with it. The Team Lead's PC is then a single user again, exactly</w:t>
+      </w:r>
+    </w:p>
+    <w:p>
+      <w:r>
+        <w:rPr>
+          <w:b w:val="0"/>
+        </w:rPr>
+        <w:t xml:space="preserve">    as before creating it, and can create or join another team at once.</w:t>
       </w:r>
     </w:p>
     <w:p>

</xml_diff>

<commit_message>
1.2.3 design D19: not in a team - Join first, Create only as Team Lead, hidden when invited (step 1b)
Co-Authored-By: Claude Opus 5.5 <noreply@anthropic.com>
</commit_message>
<xml_diff>
--- a/TEAM_ADVANCED_MODE_DESIGN.docx
+++ b/TEAM_ADVANCED_MODE_DESIGN.docx
@@ -50,7 +50,7 @@
         <w:rPr>
           <w:b w:val="0"/>
         </w:rPr>
-        <w:t xml:space="preserve"> All decisions D1–D18 answered (section 13).</w:t>
+        <w:t xml:space="preserve"> All decisions D1–D19 answered (section 13).</w:t>
       </w:r>
     </w:p>
     <w:p>
@@ -7057,6 +7057,190 @@
           <w:b w:val="0"/>
         </w:rPr>
         <w:t xml:space="preserve">  OneDrive folder once, as it asks for the team folder today.</w:t>
+      </w:r>
+    </w:p>
+    <w:p>
+      <w:pPr>
+        <w:pStyle w:val="Heading3"/>
+      </w:pPr>
+      <w:r>
+        <w:rPr>
+          <w:b w:val="0"/>
+        </w:rPr>
+        <w:t>10a.4 Not in a team yet: Join first, Create for the Team Lead only (D19 - Boaz, 2026-10-08)</w:t>
+      </w:r>
+    </w:p>
+    <w:p>
+      <w:pPr>
+        <w:pStyle w:val="ListBullet"/>
+      </w:pPr>
+      <w:r>
+        <w:rPr>
+          <w:b w:val="0"/>
+        </w:rPr>
+        <w:t>Only a Team Lead creates a team; members never do. A PC that is not in a team cannot know which one its user will</w:t>
+      </w:r>
+    </w:p>
+    <w:p>
+      <w:r>
+        <w:rPr>
+          <w:b w:val="0"/>
+        </w:rPr>
+        <w:t xml:space="preserve">  be (there is no account or server holding roles - whoever creates the team becomes its Team Lead), so the screen</w:t>
+      </w:r>
+    </w:p>
+    <w:p>
+      <w:r>
+        <w:rPr>
+          <w:b w:val="0"/>
+        </w:rPr>
+        <w:t xml:space="preserve">  steers instead:</w:t>
+      </w:r>
+    </w:p>
+    <w:p>
+      <w:r>
+        <w:rPr>
+          <w:b w:val="0"/>
+        </w:rPr>
+        <w:t xml:space="preserve">  - </w:t>
+      </w:r>
+      <w:r>
+        <w:rPr>
+          <w:b/>
+        </w:rPr>
+        <w:t>Main text and button for members:</w:t>
+      </w:r>
+      <w:r>
+        <w:rPr>
+          <w:b w:val="0"/>
+        </w:rPr>
+        <w:t xml:space="preserve"> "Your Team Lead invites you. </w:t>
+      </w:r>
+      <w:r>
+        <w:rPr>
+          <w:b/>
+        </w:rPr>
+        <w:t>Join a team…</w:t>
+      </w:r>
+      <w:r>
+        <w:rPr>
+          <w:b w:val="0"/>
+        </w:rPr>
+        <w:t>" (the dropdown of D18 offers</w:t>
+      </w:r>
+    </w:p>
+    <w:p>
+      <w:r>
+        <w:rPr>
+          <w:b w:val="0"/>
+        </w:rPr>
+        <w:t xml:space="preserve">    only teams holding an invitation for this person).</w:t>
+      </w:r>
+    </w:p>
+    <w:p>
+      <w:r>
+        <w:rPr>
+          <w:b w:val="0"/>
+        </w:rPr>
+        <w:t xml:space="preserve">  - </w:t>
+      </w:r>
+      <w:r>
+        <w:rPr>
+          <w:b/>
+        </w:rPr>
+        <w:t>Create as a smaller line below:</w:t>
+      </w:r>
+      <w:r>
+        <w:rPr>
+          <w:b w:val="0"/>
+        </w:rPr>
+        <w:t xml:space="preserve"> "Are you the Team Lead, setting up a team for your colleagues? **Create a team</w:t>
+      </w:r>
+    </w:p>
+    <w:p>
+      <w:r>
+        <w:rPr>
+          <w:b w:val="0"/>
+        </w:rPr>
+        <w:t xml:space="preserve">    as Team Lead…**". Its confirm repeats: "Only the Team Lead creates the team. If a colleague has invited you, use</w:t>
+      </w:r>
+    </w:p>
+    <w:p>
+      <w:r>
+        <w:rPr>
+          <w:b w:val="0"/>
+        </w:rPr>
+        <w:t xml:space="preserve">    Join a team instead."</w:t>
+      </w:r>
+    </w:p>
+    <w:p>
+      <w:r>
+        <w:rPr>
+          <w:b w:val="0"/>
+        </w:rPr>
+        <w:t xml:space="preserve">  - </w:t>
+      </w:r>
+      <w:r>
+        <w:rPr>
+          <w:b/>
+        </w:rPr>
+        <w:t>An invitation waiting in OneDrive for this person:</w:t>
+      </w:r>
+      <w:r>
+        <w:rPr>
+          <w:b w:val="0"/>
+        </w:rPr>
+        <w:t xml:space="preserve"> Create is not offered at all - only "Boaz has invited you</w:t>
+      </w:r>
+    </w:p>
+    <w:p>
+      <w:r>
+        <w:rPr>
+          <w:b w:val="0"/>
+        </w:rPr>
+        <w:t xml:space="preserve">    to TimeToAct2 - </w:t>
+      </w:r>
+      <w:r>
+        <w:rPr>
+          <w:b/>
+        </w:rPr>
+        <w:t>Join</w:t>
+      </w:r>
+      <w:r>
+        <w:rPr>
+          <w:b w:val="0"/>
+        </w:rPr>
+        <w:t>".</w:t>
+      </w:r>
+    </w:p>
+    <w:p>
+      <w:pPr>
+        <w:pStyle w:val="ListBullet"/>
+      </w:pPr>
+      <w:r>
+        <w:rPr>
+          <w:b w:val="0"/>
+        </w:rPr>
+        <w:t>Inside a team, Create and Join are hidden as today. A strict rule (who may ever be a Team Lead) needs the</w:t>
+      </w:r>
+    </w:p>
+    <w:p>
+      <w:r>
+        <w:rPr>
+          <w:b w:val="0"/>
+        </w:rPr>
+        <w:t xml:space="preserve">  company-wide Admin role - a later item.</w:t>
+      </w:r>
+    </w:p>
+    <w:p>
+      <w:pPr>
+        <w:pStyle w:val="ListBullet"/>
+      </w:pPr>
+      <w:r>
+        <w:rPr>
+          <w:b w:val="0"/>
+        </w:rPr>
+        <w:t>Built in step 1b with the invitations.</w:t>
       </w:r>
     </w:p>
     <w:p>
@@ -7690,7 +7874,7 @@
               <w:rPr>
                 <w:b w:val="0"/>
               </w:rPr>
-              <w:t>: an invited member joins with the invitation's name; joining without an invitation is refused; an invitation cannot be used twice.</w:t>
+              <w:t>: an invited member joins with the invitation's name; joining without an invitation is refused; an invitation cannot be used twice. Not-in-a-team screen: Join first, Create as Team Lead only, hidden when invited (D19).</w:t>
             </w:r>
           </w:p>
         </w:tc>
@@ -9376,6 +9560,45 @@
           <w:b/>
         </w:rPr>
         <w:t>Answer 2026-10-08: agreed, including SalesTeam creating the team folder.</w:t>
+      </w:r>
+    </w:p>
+    <w:p>
+      <w:pPr>
+        <w:pStyle w:val="ListBullet"/>
+      </w:pPr>
+      <w:r>
+        <w:rPr>
+          <w:b/>
+        </w:rPr>
+        <w:t>D19 — Create a team is for the Team Lead (Boaz, 2026-10-08).</w:t>
+      </w:r>
+      <w:r>
+        <w:rPr>
+          <w:b w:val="0"/>
+        </w:rPr>
+        <w:t xml:space="preserve"> Not-in-a-team screen leads with Join; Create is a</w:t>
+      </w:r>
+    </w:p>
+    <w:p>
+      <w:r>
+        <w:rPr>
+          <w:b w:val="0"/>
+        </w:rPr>
+        <w:t xml:space="preserve">  smaller "as Team Lead" line, hidden when an invitation for this person is waiting (10a.4).</w:t>
+      </w:r>
+    </w:p>
+    <w:p>
+      <w:r>
+        <w:rPr>
+          <w:b w:val="0"/>
+        </w:rPr>
+        <w:t xml:space="preserve">  </w:t>
+      </w:r>
+      <w:r>
+        <w:rPr>
+          <w:b/>
+        </w:rPr>
+        <w:t>Answer 2026-10-08: agreed.</w:t>
       </w:r>
     </w:p>
     <w:sectPr>

</xml_diff>

<commit_message>
1.2.2.24-1.2.2.26 Team advanced mode step 2: visibility and the Group dropdown
- A member sees only the accounts in their groups, with their contacts and leads: Target Accounts, Target
  Contacts, Leads Dashboard, side panel counts, Decisions, exports, the account / contact page ("This account
  is not in your groups.") and the LinkedIn badge. Team Lead and deputy see everything; no groups = as before.
- Group dropdown above the three tables (design 7, pulled forward): a member picks one of their own groups or
  "All my groups"; the Team Lead "All accounts", any group or Other. Remembered per page.
- New leads carry scannedBy; a lead of a company that is no account is shown to who scanned it (D12).
- 1.2.2.25: the Size column reads the employee count the way a group's Size does (sizeEmployeesOf).
- 1.2.2.26: the team folder message goes as soon as the folder is usable again, without a page refresh.

Co-Authored-By: Claude Opus 5.5 <noreply@anthropic.com>
</commit_message>
<xml_diff>
--- a/TEAM_ADVANCED_MODE_DESIGN.docx
+++ b/TEAM_ADVANCED_MODE_DESIGN.docx
@@ -8182,7 +8182,32 @@
               <w:rPr>
                 <w:b w:val="0"/>
               </w:rPr>
-              <w:t xml:space="preserve"> in the companies and contacts tables, Leads Dashboard, side panel, account/contact page, Decisions, exports, LinkedIn badge.</w:t>
+              <w:t xml:space="preserve"> in the companies and contacts tables, Leads Dashboard, side panel, account/contact page, Decisions, exports, LinkedIn badge. </w:t>
+            </w:r>
+            <w:r>
+              <w:rPr>
+                <w:b/>
+              </w:rPr>
+              <w:t>Built 2026-10-10 with the Group dropdown of section 7 pulled forward (Boaz):</w:t>
+            </w:r>
+            <w:r>
+              <w:rPr>
+                <w:b w:val="0"/>
+              </w:rPr>
+              <w:t xml:space="preserve"> one shared </w:t>
+            </w:r>
+            <w:r>
+              <w:rPr>
+                <w:rFonts w:ascii="Consolas" w:hAnsi="Consolas"/>
+                <w:b w:val="0"/>
+              </w:rPr>
+              <w:t>teamAccounts.groupPicker</w:t>
+            </w:r>
+            <w:r>
+              <w:rPr>
+                <w:b w:val="0"/>
+              </w:rPr>
+              <w:t xml:space="preserve"> on Target Accounts, Target Contacts and the Leads Dashboard - a member is offered "All my groups" and their own groups, the Team Lead "All accounts", every group and Other; hidden for a member in a single group; the choice is remembered per page. The Assigned pills stay as they are until step 3.</w:t>
             </w:r>
           </w:p>
         </w:tc>
@@ -8196,7 +8221,7 @@
               <w:rPr>
                 <w:b w:val="0"/>
               </w:rPr>
-              <w:t>1.2.2.10</w:t>
+              <w:t>1.2.2.24</w:t>
             </w:r>
           </w:p>
         </w:tc>
@@ -8232,7 +8257,7 @@
               <w:rPr>
                 <w:b w:val="0"/>
               </w:rPr>
-              <w:t xml:space="preserve"> Shared picker on the three pages, deep links from the overview, Groups column, header line; notice detectors; team-log lines.</w:t>
+              <w:t xml:space="preserve"> (Group dropdown: done in step 2.) Assigned as a dropdown, deep links from the overview, Groups column, header line; notice detectors; team-log lines.</w:t>
             </w:r>
           </w:p>
         </w:tc>

</xml_diff>

<commit_message>
1.2.2.33-1.2.2.36 Team advanced mode step 4: group changes
- Add to group… / Remove from group… for the Team Lead (account ⋮ on row and page, bulk bar), named groups only
- New data that would move an assigned account is held (teamGroupPins) for the Team Lead's Decisions: Group move, Move it
- An assignee left without access loses the account on every PC (void rule in the summary); the Team Lead's save
  releases it with the reason, after a count by name; the member is told in the top bar
- A member's edit that would move an account out of a group is refused; the Team Lead is warned before such an edit
- Groups column says when a move is waiting for the Team Lead's decision
- test_team_sync.py: pin, move it, unassigned moves at once, void, the Team Lead's own change

Co-Authored-By: Claude Opus 5.5 <noreply@anthropic.com>
</commit_message>
<xml_diff>
--- a/TEAM_ADVANCED_MODE_DESIGN.docx
+++ b/TEAM_ADVANCED_MODE_DESIGN.docx
@@ -8358,7 +8358,95 @@
               <w:rPr>
                 <w:b w:val="0"/>
               </w:rPr>
-              <w:t>: research moves an assigned account → pinned → approved → assignee loses it; unassigned moves at once.</w:t>
+              <w:t xml:space="preserve">: research moves an assigned account → pinned → approved → assignee loses it; unassigned moves at once. </w:t>
+            </w:r>
+            <w:r>
+              <w:rPr>
+                <w:b/>
+              </w:rPr>
+              <w:t>Built 2026-10-11:</w:t>
+            </w:r>
+            <w:r>
+              <w:rPr>
+                <w:b w:val="0"/>
+              </w:rPr>
+              <w:t xml:space="preserve"> Add to group… / Remove from group… in the account ⋮ (row and page) and as two buttons in the bulk bar, offered only where they do something; the pin is written by the PC that made the change (</w:t>
+            </w:r>
+            <w:r>
+              <w:rPr>
+                <w:rFonts w:ascii="Consolas" w:hAnsi="Consolas"/>
+                <w:b w:val="0"/>
+              </w:rPr>
+              <w:t>team-sync.js holdMoves</w:t>
+            </w:r>
+            <w:r>
+              <w:rPr>
+                <w:b w:val="0"/>
+              </w:rPr>
+              <w:t xml:space="preserve">) - a member's PC pins, the Team Lead's PC applies at once and releases an assignee left without access (the code has no "Automatic" marker on writes, and nobody can change a colleague's assigned account, so "whose PC" decides); Decisions kind </w:t>
+            </w:r>
+            <w:r>
+              <w:rPr>
+                <w:rFonts w:ascii="Consolas" w:hAnsi="Consolas"/>
+                <w:b w:val="0"/>
+              </w:rPr>
+              <w:t>group_move</w:t>
+            </w:r>
+            <w:r>
+              <w:rPr>
+                <w:b w:val="0"/>
+              </w:rPr>
+              <w:t xml:space="preserve"> (Move it / Keep it where it is), where the account would go computed from the data as it is at that moment; the void rule in the published summary (a former member's accounts are left alone, R6.4); </w:t>
+            </w:r>
+            <w:r>
+              <w:rPr>
+                <w:rFonts w:ascii="Consolas" w:hAnsi="Consolas"/>
+                <w:b w:val="0"/>
+              </w:rPr>
+              <w:t>TEAM_RELEASE_VOID</w:t>
+            </w:r>
+            <w:r>
+              <w:rPr>
+                <w:b w:val="0"/>
+              </w:rPr>
+              <w:t xml:space="preserve"> after every save that voids assignments, with the count by name before saving; the "… no longer in your groups" notice; the Groups column says "(move to VIP - waiting for the Team Lead's decision)". </w:t>
+            </w:r>
+            <w:r>
+              <w:rPr>
+                <w:b/>
+              </w:rPr>
+              <w:t>Changed after the live test (Boaz, 2026-10-11):</w:t>
+            </w:r>
+            <w:r>
+              <w:rPr>
+                <w:b w:val="0"/>
+              </w:rPr>
+              <w:t xml:space="preserve"> a member's hand edit that would move an account out of a group is refused on Save ("Only the Team Lead moves an account to another group"); the Team Lead's or deputy's own edit applies at once after a warning pop-up (Save and move it / Cancel); the </w:t>
+            </w:r>
+            <w:r>
+              <w:rPr>
+                <w:rFonts w:ascii="Consolas" w:hAnsi="Consolas"/>
+                <w:b w:val="0"/>
+              </w:rPr>
+              <w:t>group_move</w:t>
+            </w:r>
+            <w:r>
+              <w:rPr>
+                <w:b w:val="0"/>
+              </w:rPr>
+              <w:t xml:space="preserve"> card has one answer, </w:t>
+            </w:r>
+            <w:r>
+              <w:rPr>
+                <w:b/>
+              </w:rPr>
+              <w:t>Move it</w:t>
+            </w:r>
+            <w:r>
+              <w:rPr>
+                <w:b w:val="0"/>
+              </w:rPr>
+              <w:t xml:space="preserve"> - "Keep it where it is" is removed (wrong data is corrected on the account, and the card goes by itself). The pin remains for what research and the pipeline find on an assigned account.</w:t>
             </w:r>
           </w:p>
         </w:tc>
@@ -8372,7 +8460,7 @@
               <w:rPr>
                 <w:b w:val="0"/>
               </w:rPr>
-              <w:t>1.2.2.12</w:t>
+              <w:t>1.2.2.33-36</w:t>
             </w:r>
           </w:p>
         </w:tc>

</xml_diff>